<commit_message>
Added Summaries to staff dash board on Book totals Overdue books and total books borrowed
</commit_message>
<xml_diff>
--- a/Docs/The plot twist working document.docx
+++ b/Docs/The plot twist working document.docx
@@ -42,17 +42,20 @@
           <w:numId w:val="6"/>
         </w:numPr>
         <w:rPr>
-          <w:lang w:eastAsia="en-AU"/>
-        </w:rPr>
-      </w:pPr>
-      <w:r>
-        <w:rPr>
+          <w:color w:val="124F1A" w:themeColor="accent3" w:themeShade="BF"/>
+          <w:lang w:eastAsia="en-AU"/>
+        </w:rPr>
+      </w:pPr>
+      <w:r>
+        <w:rPr>
+          <w:color w:val="124F1A" w:themeColor="accent3" w:themeShade="BF"/>
           <w:lang w:eastAsia="en-AU"/>
         </w:rPr>
         <w:t xml:space="preserve">Add </w:t>
       </w:r>
       <w:r>
         <w:rPr>
+          <w:color w:val="124F1A" w:themeColor="accent3" w:themeShade="BF"/>
           <w:lang w:eastAsia="en-AU"/>
         </w:rPr>
         <w:t xml:space="preserve">user functionality </w:t>
@@ -66,11 +69,13 @@
           <w:numId w:val="6"/>
         </w:numPr>
         <w:rPr>
-          <w:lang w:eastAsia="en-AU"/>
-        </w:rPr>
-      </w:pPr>
-      <w:r>
-        <w:rPr>
+          <w:color w:val="124F1A" w:themeColor="accent3" w:themeShade="BF"/>
+          <w:lang w:eastAsia="en-AU"/>
+        </w:rPr>
+      </w:pPr>
+      <w:r>
+        <w:rPr>
+          <w:color w:val="124F1A" w:themeColor="accent3" w:themeShade="BF"/>
           <w:lang w:eastAsia="en-AU"/>
         </w:rPr>
         <w:t xml:space="preserve">Borrow history functionality </w:t>
@@ -84,11 +89,13 @@
           <w:numId w:val="6"/>
         </w:numPr>
         <w:rPr>
-          <w:lang w:eastAsia="en-AU"/>
-        </w:rPr>
-      </w:pPr>
-      <w:r>
-        <w:rPr>
+          <w:color w:val="124F1A" w:themeColor="accent3" w:themeShade="BF"/>
+          <w:lang w:eastAsia="en-AU"/>
+        </w:rPr>
+      </w:pPr>
+      <w:r>
+        <w:rPr>
+          <w:color w:val="124F1A" w:themeColor="accent3" w:themeShade="BF"/>
           <w:lang w:eastAsia="en-AU"/>
         </w:rPr>
         <w:t xml:space="preserve">Log out function </w:t>
@@ -129,14 +136,12 @@
           <w:lang w:eastAsia="en-AU"/>
         </w:rPr>
       </w:pPr>
-      <w:proofErr w:type="gramStart"/>
-      <w:r>
-        <w:rPr>
-          <w:lang w:eastAsia="en-AU"/>
-        </w:rPr>
-        <w:t>Summary  buttons</w:t>
-      </w:r>
-      <w:proofErr w:type="gramEnd"/>
+      <w:r>
+        <w:rPr>
+          <w:lang w:eastAsia="en-AU"/>
+        </w:rPr>
+        <w:t>Summary buttons</w:t>
+      </w:r>
       <w:r>
         <w:rPr>
           <w:lang w:eastAsia="en-AU"/>
@@ -149,19 +154,17 @@
         </w:rPr>
         <w:t xml:space="preserve">for staff </w:t>
       </w:r>
-      <w:proofErr w:type="spellStart"/>
-      <w:r>
-        <w:rPr>
-          <w:lang w:eastAsia="en-AU"/>
-        </w:rPr>
-        <w:t>creen</w:t>
-      </w:r>
-      <w:proofErr w:type="spellEnd"/>
-      <w:r>
-        <w:rPr>
-          <w:lang w:eastAsia="en-AU"/>
-        </w:rPr>
-        <w:t xml:space="preserve"> on total books out …… </w:t>
+      <w:r>
+        <w:rPr>
+          <w:lang w:eastAsia="en-AU"/>
+        </w:rPr>
+        <w:t>s</w:t>
+      </w:r>
+      <w:r>
+        <w:rPr>
+          <w:lang w:eastAsia="en-AU"/>
+        </w:rPr>
+        <w:t xml:space="preserve">creen on total books out …… </w:t>
       </w:r>
     </w:p>
     <w:p>
@@ -209,11 +212,13 @@
           <w:numId w:val="6"/>
         </w:numPr>
         <w:rPr>
-          <w:lang w:eastAsia="en-AU"/>
-        </w:rPr>
-      </w:pPr>
-      <w:r>
-        <w:rPr>
+          <w:color w:val="124F1A" w:themeColor="accent3" w:themeShade="BF"/>
+          <w:lang w:eastAsia="en-AU"/>
+        </w:rPr>
+      </w:pPr>
+      <w:r>
+        <w:rPr>
+          <w:color w:val="124F1A" w:themeColor="accent3" w:themeShade="BF"/>
           <w:lang w:eastAsia="en-AU"/>
         </w:rPr>
         <w:t xml:space="preserve">Helpers </w:t>
@@ -2382,6 +2387,9 @@
     <w:p/>
     <w:p>
       <w:r>
+        <w:rPr>
+          <w:noProof/>
+        </w:rPr>
         <w:drawing>
           <wp:inline distT="0" distB="0" distL="0" distR="0" wp14:anchorId="673AF8BC" wp14:editId="030FE923">
             <wp:extent cx="3429025" cy="3200423"/>
@@ -4359,6 +4367,7 @@
   <w:style w:type="character" w:default="1" w:styleId="DefaultParagraphFont">
     <w:name w:val="Default Paragraph Font"/>
     <w:uiPriority w:val="1"/>
+    <w:semiHidden/>
     <w:unhideWhenUsed/>
   </w:style>
   <w:style w:type="table" w:default="1" w:styleId="TableNormal">

</xml_diff>